<commit_message>
Remove unused prison dataset and clean up ETL, schema, and documentation
</commit_message>
<xml_diff>
--- a/Dataset_Information.docx
+++ b/Dataset_Information.docx
@@ -117,62 +117,7 @@
         <w:pStyle w:val="Heading2"/>
       </w:pPr>
       <w:r>
-        <w:t>3. Indian Prison Statistics</w:t>
-      </w:r>
-    </w:p>
-    <w:p>
-      <w:r>
-        <w:t>Source Link: https://ncrb.gov.in/en/prison-statistics-india</w:t>
-      </w:r>
-    </w:p>
-    <w:p>
-      <w:r>
-        <w:t>Usage: This dataset is used to build the Dim_Prison_Stats dimension table. It provides contextual socio-economic data regarding the prison population, specifically focusing on the educational backgrounds of inmates to support the illiteracy correlation.</w:t>
-      </w:r>
-    </w:p>
-    <w:p>
-      <w:r>
-        <w:t>Columns Used:</w:t>
-      </w:r>
-    </w:p>
-    <w:p>
-      <w:pPr>
-        <w:pStyle w:val="ListBullet"/>
-      </w:pPr>
-      <w:r>
-        <w:t>• State/UT</w:t>
-      </w:r>
-    </w:p>
-    <w:p>
-      <w:pPr>
-        <w:pStyle w:val="ListBullet"/>
-      </w:pPr>
-      <w:r>
-        <w:t>• Total - Total (mapped to Total_Prisoners)</w:t>
-      </w:r>
-    </w:p>
-    <w:p>
-      <w:pPr>
-        <w:pStyle w:val="ListBullet"/>
-      </w:pPr>
-      <w:r>
-        <w:t>• Educational Standard - Illiterate (mapped to Illiterate_Prisoners)</w:t>
-      </w:r>
-    </w:p>
-    <w:p>
-      <w:pPr>
-        <w:pStyle w:val="ListBullet"/>
-      </w:pPr>
-      <w:r>
-        <w:t>• Educational Standard - Graduate (mapped to Graduate_Prisoners)</w:t>
-      </w:r>
-    </w:p>
-    <w:p>
-      <w:pPr>
-        <w:pStyle w:val="Heading2"/>
-      </w:pPr>
-      <w:r>
-        <w:t>4. Wikipedia: Crime in India (Live Web Scrape)</w:t>
+        <w:t>3. Wikipedia: Crime in India (Live Web Scrape)</w:t>
       </w:r>
     </w:p>
     <w:p>
@@ -211,7 +156,7 @@
         <w:pStyle w:val="Heading2"/>
       </w:pPr>
       <w:r>
-        <w:t>5. Wikipedia: Indian States by Literacy Rate (Live Web Scrape)</w:t>
+        <w:t>4. Wikipedia: Indian States by Literacy Rate (Live Web Scrape)</w:t>
       </w:r>
     </w:p>
     <w:p>

</xml_diff>

<commit_message>
Replace Wikipedia live web scrapes with downloaded local CSV files
</commit_message>
<xml_diff>
--- a/Dataset_Information.docx
+++ b/Dataset_Information.docx
@@ -117,17 +117,17 @@
         <w:pStyle w:val="Heading2"/>
       </w:pPr>
       <w:r>
-        <w:t>3. Wikipedia: Crime in India (Live Web Scrape)</w:t>
+        <w:t>3. Wikipedia: Crime in India (Local CSV)</w:t>
       </w:r>
     </w:p>
     <w:p>
       <w:r>
-        <w:t>Source Link: https://en.wikipedia.org/wiki/Crime_in_India</w:t>
+        <w:t>Source Link: https://en.wikipedia.org/wiki/Crime_in_India (Saved as wikipedia_crime_in_india.csv)</w:t>
       </w:r>
     </w:p>
     <w:p>
       <w:r>
-        <w:t>Usage: The ETL pipeline live-scrapes the HTML tables on this page to extract the historical total crime records registered in 2017 for every state. This acts as the pure data baseline for the exact 2017 to 2024 comparisons. Note: Granular breakdowns for specific violent crimes (Murder, Rape, etc.) are not publicly available in this dataset, so the project strictly analyzes "Total Crimes" for the historical comparison.</w:t>
+        <w:t>Usage: The ETL pipeline reads from this local CSV to extract the historical total crime records registered in 2017 for every state. This acts as the pure data baseline for the exact 2017 to 2024 comparisons. Note: Granular breakdowns for specific violent crimes (Murder, Rape, etc.) are not publicly available in this dataset, so the project strictly analyzes "Total Crimes" for the historical comparison.</w:t>
       </w:r>
     </w:p>
     <w:p>
@@ -156,17 +156,17 @@
         <w:pStyle w:val="Heading2"/>
       </w:pPr>
       <w:r>
-        <w:t>4. Wikipedia: Indian States by Literacy Rate (Live Web Scrape)</w:t>
+        <w:t>4. Wikipedia: Indian States by Literacy Rate (Local CSV)</w:t>
       </w:r>
     </w:p>
     <w:p>
       <w:r>
-        <w:t>Source Link: https://en.wikipedia.org/wiki/List_of_Indian_states_and_union_territories_by_literacy_rate</w:t>
+        <w:t>Source Link: https://en.wikipedia.org/wiki/List_of_Indian_states_and_union_territories_by_literacy_rate (Saved as wikipedia_literacy_rates.csv)</w:t>
       </w:r>
     </w:p>
     <w:p>
       <w:r>
-        <w:t>Usage: The pipeline actively scrapes this page to extract the official 2017 National Statistical Office (NSO) Survey and the 2023-2024 Periodic Labour Force Survey (PLFS). This provides the exact literacy and illiteracy percentages used to prove the mathematical correlation between illiteracy and crime.</w:t>
+        <w:t>Usage: The pipeline reads this local CSV to extract the official 2017 National Statistical Office (NSO) Survey and the 2023-2024 Periodic Labour Force Survey (PLFS). This provides the exact literacy and illiteracy percentages used to prove the mathematical correlation between illiteracy and crime.</w:t>
       </w:r>
     </w:p>
     <w:p>

</xml_diff>

<commit_message>
Update dataset documentation to reflect new 40k row Kaggle dataset
</commit_message>
<xml_diff>
--- a/Dataset_Information.docx
+++ b/Dataset_Information.docx
@@ -15,17 +15,17 @@
         <w:pStyle w:val="Heading2"/>
       </w:pPr>
       <w:r>
-        <w:t>1. Real Crime Data Scraped (2023/2024 proxy)</w:t>
+        <w:t>1. Indian Crimes Dataset (Kaggle - 40,000+ rows)</w:t>
       </w:r>
     </w:p>
     <w:p>
       <w:r>
-        <w:t>Source Link: https://ncrb.gov.in/en/crime-in-india</w:t>
+        <w:t>Source Link: https://www.kaggle.com/datasets/sudhanvahg/indian-crimes-dataset (Saved as crime_dataset_india.csv)</w:t>
       </w:r>
     </w:p>
     <w:p>
       <w:r>
-        <w:t>Usage: This dataset provides the highly detailed, state-wise breakdown of various crimes (Murder, Rape, Kidnapping, Robbery, etc.). Because the raw 2024 crime dataset is not yet publicly accessible in a structured format, this 2023 dataset is used as a 1:1 proxy for 2024 to perfectly align with the 2024 literacy survey for correlative analysis.</w:t>
+        <w:t>Usage: This massive 5MB dataset contains over 40,000 incident-level records of crimes committed across major Indian cities from 2020 to 2024. The ETL pipeline filters these incidents for the year 2024, maps the cities to their respective states using the demographics dataset, and aggregates them. Because it is a sample dataset, the totals are mathematically scaled to represent accurate national magnitude for correlative analysis.</w:t>
       </w:r>
     </w:p>
     <w:p>
@@ -38,7 +38,7 @@
         <w:pStyle w:val="ListBullet"/>
       </w:pPr>
       <w:r>
-        <w:t>• State / UT</w:t>
+        <w:t>• City (mapped to State)</w:t>
       </w:r>
     </w:p>
     <w:p>
@@ -46,7 +46,7 @@
         <w:pStyle w:val="ListBullet"/>
       </w:pPr>
       <w:r>
-        <w:t>• Total Crimes (IPC+SLL) 2023</w:t>
+        <w:t>• Date of Occurrence (filtered for 2024)</w:t>
       </w:r>
     </w:p>
     <w:p>
@@ -54,7 +54,7 @@
         <w:pStyle w:val="ListBullet"/>
       </w:pPr>
       <w:r>
-        <w:t>• Crime Rate (IPC+SLL) 2023</w:t>
+        <w:t>• Report Number (used to count Total Crimes)</w:t>
       </w:r>
     </w:p>
     <w:p>
@@ -62,7 +62,7 @@
         <w:pStyle w:val="ListBullet"/>
       </w:pPr>
       <w:r>
-        <w:t>• Murder 2023, Rape 2023, Kidnapping 2023, Robbery &amp; Dacoity 2023, Hit &amp; Run 2023, Illegal arms 2023, Corruption (Total cases) 2023</w:t>
+        <w:t>• Crime Description (used to filter Murder, Rape, Kidnapping, Robbery, etc.)</w:t>
       </w:r>
     </w:p>
     <w:p>

</xml_diff>